<commit_message>
Complete Stock Metrics enhancement
- Expand Stock Analyzer to 55% width
- Add EMA 50, EMA 200, P/E Ratio indicators
- Update indicators grid to 3-column layout
- Change default period from 5Y to 6M
- Make ticker input flexible (accept 'hdfc bank', 'infy', etc)
- Add stock name mapping for common aliases
</commit_message>
<xml_diff>
--- a/Note of process.docx
+++ b/Note of process.docx
@@ -1,7 +1,37 @@
 
 <file path=word/document.xml><?xml version="1.0" encoding="utf-8"?>
-<w:document xmlns:wpc="http://schemas.microsoft.com/office/word/2010/wordprocessingCanvas" xmlns:cx="http://schemas.microsoft.com/office/drawing/2014/chartex" xmlns:cx1="http://schemas.microsoft.com/office/drawing/2015/9/8/chartex" xmlns:cx2="http://schemas.microsoft.com/office/drawing/2015/10/21/chartex" xmlns:cx3="http://schemas.microsoft.com/office/drawing/2016/5/9/chartex" xmlns:cx4="http://schemas.microsoft.com/office/drawing/2016/5/10/chartex" xmlns:cx5="http://schemas.microsoft.com/office/drawing/2016/5/11/chartex" xmlns:cx6="http://schemas.microsoft.com/office/drawing/2016/5/12/chartex" xmlns:cx7="http://schemas.microsoft.com/office/drawing/2016/5/13/chartex" xmlns:cx8="http://schemas.microsoft.com/office/drawing/2016/5/14/chartex" xmlns:mc="http://schemas.openxmlformats.org/markup-compatibility/2006" xmlns:aink="http://schemas.microsoft.com/office/drawing/2016/ink" xmlns:am3d="http://schemas.microsoft.com/office/drawing/2017/model3d" xmlns:o="urn:schemas-microsoft-com:office:office" xmlns:oel="http://schemas.microsoft.com/office/2019/extlst" xmlns:r="http://schemas.openxmlformats.org/officeDocument/2006/relationships" xmlns:m="http://schemas.openxmlformats.org/officeDocument/2006/math" xmlns:v="urn:schemas-microsoft-com:vml" xmlns:wp14="http://schemas.microsoft.com/office/word/2010/wordprocessingDrawing" xmlns:wp="http://schemas.openxmlformats.org/drawingml/2006/wordprocessingDrawing" xmlns:w10="urn:schemas-microsoft-com:office:word" xmlns:w="http://schemas.openxmlformats.org/wordprocessingml/2006/main" xmlns:w14="http://schemas.microsoft.com/office/word/2010/wordml" xmlns:w15="http://schemas.microsoft.com/office/word/2012/wordml" xmlns:w16cex="http://schemas.microsoft.com/office/word/2018/wordml/cex" xmlns:w16cid="http://schemas.microsoft.com/office/word/2016/wordml/cid" xmlns:w16="http://schemas.microsoft.com/office/word/2018/wordml" xmlns:w16du="http://schemas.microsoft.com/office/word/2023/wordml/word16du" xmlns:w16sdtdh="http://schemas.microsoft.com/office/word/2020/wordml/sdtdatahash" xmlns:w16sdtfl="http://schemas.microsoft.com/office/word/2024/wordml/sdtformatlock" xmlns:w16se="http://schemas.microsoft.com/office/word/2015/wordml/symex" xmlns:wpg="http://schemas.microsoft.com/office/word/2010/wordprocessingGroup" xmlns:wpi="http://schemas.microsoft.com/office/word/2010/wordprocessingInk" xmlns:wne="http://schemas.microsoft.com/office/word/2006/wordml" xmlns:wps="http://schemas.microsoft.com/office/word/2010/wordprocessingShape" mc:Ignorable="w14 w15 w16se w16cid w16 w16cex w16sdtdh w16sdtfl w16du wp14">
+<w:document xmlns:wpc="http://schemas.microsoft.com/office/word/2010/wordprocessingCanvas" xmlns:cx="http://schemas.microsoft.com/office/drawing/2014/chartex" xmlns:cx1="http://schemas.microsoft.com/office/drawing/2015/9/8/chartex" xmlns:cx2="http://schemas.microsoft.com/office/drawing/2015/10/21/chartex" xmlns:cx3="http://schemas.microsoft.com/office/drawing/2016/5/9/chartex" xmlns:cx4="http://schemas.microsoft.com/office/drawing/2016/5/10/chartex" xmlns:cx5="http://schemas.microsoft.com/office/drawing/2016/5/11/chartex" xmlns:cx6="http://schemas.microsoft.com/office/drawing/2016/5/12/chartex" xmlns:cx7="http://schemas.microsoft.com/office/drawing/2016/5/13/chartex" xmlns:cx8="http://schemas.microsoft.com/office/drawing/2016/5/14/chartex" xmlns:mc="http://schemas.openxmlformats.org/markup-compatibility/2006" xmlns:aink="http://schemas.microsoft.com/office/drawing/2016/ink" xmlns:am3d="http://schemas.microsoft.com/office/drawing/2017/model3d" xmlns:o="urn:schemas-microsoft-com:office:office" xmlns:oel="http://schemas.microsoft.com/office/2019/extlst" xmlns:r="http://schemas.openxmlformats.org/officeDocument/2006/relationships" xmlns:m="http://schemas.openxmlformats.org/officeDocument/2006/math" xmlns:v="urn:schemas-microsoft-com:vml" xmlns:wp14="http://schemas.microsoft.com/office/word/2010/wordprocessingDrawing" xmlns:wp="http://schemas.openxmlformats.org/drawingml/2006/wordprocessingDrawing" xmlns:w10="urn:schemas-microsoft-com:office:word" xmlns:w="http://schemas.openxmlformats.org/wordprocessingml/2006/main" xmlns:w14="http://schemas.microsoft.com/office/word/2010/wordml" xmlns:w15="http://schemas.microsoft.com/office/word/2012/wordml" xmlns:w16cei="http://schemas.microsoft.com/office/word/2026/wordml/cei" xmlns:w16cex="http://schemas.microsoft.com/office/word/2018/wordml/cex" xmlns:w16cid="http://schemas.microsoft.com/office/word/2016/wordml/cid" xmlns:w16="http://schemas.microsoft.com/office/word/2018/wordml" xmlns:w16du="http://schemas.microsoft.com/office/word/2023/wordml/word16du" xmlns:w16sdtdh="http://schemas.microsoft.com/office/word/2020/wordml/sdtdatahash" xmlns:w16sdtfl="http://schemas.microsoft.com/office/word/2024/wordml/sdtformatlock" xmlns:w16se="http://schemas.microsoft.com/office/word/2015/wordml/symex" xmlns:wpg="http://schemas.microsoft.com/office/word/2010/wordprocessingGroup" xmlns:wpi="http://schemas.microsoft.com/office/word/2010/wordprocessingInk" xmlns:wne="http://schemas.microsoft.com/office/word/2006/wordml" xmlns:wps="http://schemas.microsoft.com/office/word/2010/wordprocessingShape" mc:Ignorable="w14 w15 w16se w16cid w16 w16cex w16sdtdh w16sdtfl w16du wp14">
   <w:body>
+    <w:p>
+      <w:r>
+        <w:t xml:space="preserve">  Who is the user? (retail investors — define this explicitly) </w:t>
+      </w:r>
+    </w:p>
+    <w:p>
+      <w:r>
+        <w:t xml:space="preserve">  What problem does it solve? (define the "why" — this is literally product strategy) </w:t>
+      </w:r>
+    </w:p>
+    <w:p>
+      <w:r>
+        <w:t xml:space="preserve">  What did you prioritize first and why? (this is roadmap thinking) </w:t>
+      </w:r>
+    </w:p>
+    <w:p>
+      <w:r>
+        <w:t xml:space="preserve">  Did you get any real user feedback, even from 5 friends testing it? (this is user research) </w:t>
+      </w:r>
+    </w:p>
+    <w:p>
+      <w:pPr>
+        <w:rPr>
+          <w:lang w:val="en-US"/>
+        </w:rPr>
+      </w:pPr>
+      <w:r>
+        <w:t>  What would you build next, and why? (this is forward-looking product vision)</w:t>
+      </w:r>
+    </w:p>
     <w:p>
       <w:pPr>
         <w:rPr>
@@ -901,6 +931,7 @@
         <w:rPr>
           <w:lang w:val="en-US"/>
         </w:rPr>
+        <w:lastRenderedPageBreak/>
         <w:t xml:space="preserve">  --data '{"model": "claude-sonnet-4-6", "</w:t>
       </w:r>
       <w:proofErr w:type="spellStart"/>
@@ -1019,7 +1050,6 @@
         <w:rPr>
           <w:color w:val="000000" w:themeColor="text1"/>
         </w:rPr>
-        <w:lastRenderedPageBreak/>
         <w:t>Name</w:t>
       </w:r>
     </w:p>
@@ -1899,7 +1929,6 @@
               <w:rPr>
                 <w:color w:val="000000" w:themeColor="text1"/>
               </w:rPr>
-              <w:lastRenderedPageBreak/>
               <w:t>A — Mutual Funds</w:t>
             </w:r>
           </w:p>
@@ -3166,6 +3195,7 @@
           <w:iCs/>
           <w:color w:val="000000" w:themeColor="text1"/>
         </w:rPr>
+        <w:lastRenderedPageBreak/>
         <w:t>All 8 tools wired in</w:t>
       </w:r>
     </w:p>
@@ -3223,36 +3253,7 @@
         <w:rPr>
           <w:color w:val="000000" w:themeColor="text1"/>
         </w:rPr>
-        <w:lastRenderedPageBreak/>
-        <w:t xml:space="preserve">if the user asks about some single or multiple stocks - </w:t>
-      </w:r>
-      <w:proofErr w:type="gramStart"/>
-      <w:r>
-        <w:rPr>
-          <w:color w:val="000000" w:themeColor="text1"/>
-        </w:rPr>
-        <w:t>tell</w:t>
-      </w:r>
-      <w:proofErr w:type="gramEnd"/>
-      <w:r>
-        <w:rPr>
-          <w:color w:val="000000" w:themeColor="text1"/>
-        </w:rPr>
-        <w:t xml:space="preserve"> about its price, sector impact factor in 3 lines max, short term &amp; </w:t>
-      </w:r>
-      <w:proofErr w:type="gramStart"/>
-      <w:r>
-        <w:rPr>
-          <w:color w:val="000000" w:themeColor="text1"/>
-        </w:rPr>
-        <w:t>long term</w:t>
-      </w:r>
-      <w:proofErr w:type="gramEnd"/>
-      <w:r>
-        <w:rPr>
-          <w:color w:val="000000" w:themeColor="text1"/>
-        </w:rPr>
-        <w:t xml:space="preserve"> view with pros cons in 2-3 points each, lastly do comparison in table format with peers of same sector on price per share, 52 week high/low, last 3 years &amp; 5 years growth %, PE ratio, Dividend yielded per year and these should be spot figures no heavy text needed</w:t>
+        <w:t>if the user asks about some single or multiple stocks - tell about its price, sector impact factor in 3 lines max, short term &amp; long term view with pros cons in 2-3 points each, lastly do comparison in table format with peers of same sector on price per share, 52 week high/low, last 3 years &amp; 5 years growth %, PE ratio, Dividend yielded per year and these should be spot figures no heavy text needed</w:t>
       </w:r>
     </w:p>
     <w:p>
@@ -3632,6 +3633,7 @@
           <w:color w:val="000000" w:themeColor="text1"/>
           <w:lang w:val="en-US"/>
         </w:rPr>
+        <w:lastRenderedPageBreak/>
         <w:t>| 3 Year | 13-Jun-2023 | ₹58.51 |</w:t>
       </w:r>
     </w:p>
@@ -3713,7 +3715,6 @@
           <w:color w:val="000000" w:themeColor="text1"/>
           <w:lang w:val="en-US"/>
         </w:rPr>
-        <w:lastRenderedPageBreak/>
         <w:t>|-------|-------------|</w:t>
       </w:r>
     </w:p>
@@ -4632,6 +4633,7 @@
           <w:bCs/>
           <w:color w:val="000000" w:themeColor="text1"/>
         </w:rPr>
+        <w:lastRenderedPageBreak/>
         <w:t>Analytics Dashboard - Where to View</w:t>
       </w:r>
     </w:p>
@@ -4689,7 +4691,6 @@
         <w:rPr>
           <w:color w:val="000000" w:themeColor="text1"/>
         </w:rPr>
-        <w:lastRenderedPageBreak/>
         <w:t>After you deploy (or while running locally), open these URLs:</w:t>
       </w:r>
     </w:p>
@@ -4870,19 +4871,11 @@
         <w:t xml:space="preserve">    "</w:t>
       </w:r>
       <w:proofErr w:type="spellStart"/>
-      <w:proofErr w:type="gramStart"/>
-      <w:r>
-        <w:rPr>
-          <w:color w:val="000000" w:themeColor="text1"/>
-        </w:rPr>
-        <w:t>not</w:t>
-      </w:r>
-      <w:proofErr w:type="gramEnd"/>
-      <w:r>
-        <w:rPr>
-          <w:color w:val="000000" w:themeColor="text1"/>
-        </w:rPr>
-        <w:t>_helpful</w:t>
+      <w:r>
+        <w:rPr>
+          <w:color w:val="000000" w:themeColor="text1"/>
+        </w:rPr>
+        <w:t>not_helpful</w:t>
       </w:r>
       <w:proofErr w:type="spellEnd"/>
       <w:r>
@@ -4905,19 +4898,11 @@
         <w:t xml:space="preserve">    "</w:t>
       </w:r>
       <w:proofErr w:type="spellStart"/>
-      <w:proofErr w:type="gramStart"/>
-      <w:r>
-        <w:rPr>
-          <w:color w:val="000000" w:themeColor="text1"/>
-        </w:rPr>
-        <w:t>satisfaction</w:t>
-      </w:r>
-      <w:proofErr w:type="gramEnd"/>
-      <w:r>
-        <w:rPr>
-          <w:color w:val="000000" w:themeColor="text1"/>
-        </w:rPr>
-        <w:t>_rate</w:t>
+      <w:r>
+        <w:rPr>
+          <w:color w:val="000000" w:themeColor="text1"/>
+        </w:rPr>
+        <w:t>satisfaction_rate</w:t>
       </w:r>
       <w:proofErr w:type="spellEnd"/>
       <w:r>
@@ -4966,19 +4951,11 @@
         <w:t xml:space="preserve">    "</w:t>
       </w:r>
       <w:proofErr w:type="spellStart"/>
-      <w:proofErr w:type="gramStart"/>
-      <w:r>
-        <w:rPr>
-          <w:color w:val="000000" w:themeColor="text1"/>
-        </w:rPr>
-        <w:t>total</w:t>
-      </w:r>
-      <w:proofErr w:type="gramEnd"/>
-      <w:r>
-        <w:rPr>
-          <w:color w:val="000000" w:themeColor="text1"/>
-        </w:rPr>
-        <w:t>_calls</w:t>
+      <w:r>
+        <w:rPr>
+          <w:color w:val="000000" w:themeColor="text1"/>
+        </w:rPr>
+        <w:t>total_calls</w:t>
       </w:r>
       <w:proofErr w:type="spellEnd"/>
       <w:r>
@@ -5001,19 +4978,11 @@
         <w:t xml:space="preserve">    "</w:t>
       </w:r>
       <w:proofErr w:type="spellStart"/>
-      <w:proofErr w:type="gramStart"/>
-      <w:r>
-        <w:rPr>
-          <w:color w:val="000000" w:themeColor="text1"/>
-        </w:rPr>
-        <w:t>most</w:t>
-      </w:r>
-      <w:proofErr w:type="gramEnd"/>
-      <w:r>
-        <w:rPr>
-          <w:color w:val="000000" w:themeColor="text1"/>
-        </w:rPr>
-        <w:t>_used</w:t>
+      <w:r>
+        <w:rPr>
+          <w:color w:val="000000" w:themeColor="text1"/>
+        </w:rPr>
+        <w:t>most_used</w:t>
       </w:r>
       <w:proofErr w:type="spellEnd"/>
       <w:r>
@@ -5036,19 +5005,11 @@
         <w:t xml:space="preserve">      "</w:t>
       </w:r>
       <w:proofErr w:type="spellStart"/>
-      <w:proofErr w:type="gramStart"/>
-      <w:r>
-        <w:rPr>
-          <w:color w:val="000000" w:themeColor="text1"/>
-        </w:rPr>
-        <w:t>get</w:t>
-      </w:r>
-      <w:proofErr w:type="gramEnd"/>
-      <w:r>
-        <w:rPr>
-          <w:color w:val="000000" w:themeColor="text1"/>
-        </w:rPr>
-        <w:t>_stock_data</w:t>
+      <w:r>
+        <w:rPr>
+          <w:color w:val="000000" w:themeColor="text1"/>
+        </w:rPr>
+        <w:t>get_stock_data</w:t>
       </w:r>
       <w:proofErr w:type="spellEnd"/>
       <w:r>
@@ -5071,19 +5032,11 @@
         <w:t xml:space="preserve">      "</w:t>
       </w:r>
       <w:proofErr w:type="spellStart"/>
-      <w:proofErr w:type="gramStart"/>
-      <w:r>
-        <w:rPr>
-          <w:color w:val="000000" w:themeColor="text1"/>
-        </w:rPr>
-        <w:t>get</w:t>
-      </w:r>
-      <w:proofErr w:type="gramEnd"/>
-      <w:r>
-        <w:rPr>
-          <w:color w:val="000000" w:themeColor="text1"/>
-        </w:rPr>
-        <w:t>_stock_news</w:t>
+      <w:r>
+        <w:rPr>
+          <w:color w:val="000000" w:themeColor="text1"/>
+        </w:rPr>
+        <w:t>get_stock_news</w:t>
       </w:r>
       <w:proofErr w:type="spellEnd"/>
       <w:r>
@@ -5164,7 +5117,7 @@
 </file>
 
 <file path=word/numbering.xml><?xml version="1.0" encoding="utf-8"?>
-<w:numbering xmlns:wpc="http://schemas.microsoft.com/office/word/2010/wordprocessingCanvas" xmlns:cx="http://schemas.microsoft.com/office/drawing/2014/chartex" xmlns:cx1="http://schemas.microsoft.com/office/drawing/2015/9/8/chartex" xmlns:cx2="http://schemas.microsoft.com/office/drawing/2015/10/21/chartex" xmlns:cx3="http://schemas.microsoft.com/office/drawing/2016/5/9/chartex" xmlns:cx4="http://schemas.microsoft.com/office/drawing/2016/5/10/chartex" xmlns:cx5="http://schemas.microsoft.com/office/drawing/2016/5/11/chartex" xmlns:cx6="http://schemas.microsoft.com/office/drawing/2016/5/12/chartex" xmlns:cx7="http://schemas.microsoft.com/office/drawing/2016/5/13/chartex" xmlns:cx8="http://schemas.microsoft.com/office/drawing/2016/5/14/chartex" xmlns:mc="http://schemas.openxmlformats.org/markup-compatibility/2006" xmlns:aink="http://schemas.microsoft.com/office/drawing/2016/ink" xmlns:am3d="http://schemas.microsoft.com/office/drawing/2017/model3d" xmlns:o="urn:schemas-microsoft-com:office:office" xmlns:oel="http://schemas.microsoft.com/office/2019/extlst" xmlns:r="http://schemas.openxmlformats.org/officeDocument/2006/relationships" xmlns:m="http://schemas.openxmlformats.org/officeDocument/2006/math" xmlns:v="urn:schemas-microsoft-com:vml" xmlns:wp14="http://schemas.microsoft.com/office/word/2010/wordprocessingDrawing" xmlns:wp="http://schemas.openxmlformats.org/drawingml/2006/wordprocessingDrawing" xmlns:w10="urn:schemas-microsoft-com:office:word" xmlns:w="http://schemas.openxmlformats.org/wordprocessingml/2006/main" xmlns:w14="http://schemas.microsoft.com/office/word/2010/wordml" xmlns:w15="http://schemas.microsoft.com/office/word/2012/wordml" xmlns:w16cex="http://schemas.microsoft.com/office/word/2018/wordml/cex" xmlns:w16cid="http://schemas.microsoft.com/office/word/2016/wordml/cid" xmlns:w16="http://schemas.microsoft.com/office/word/2018/wordml" xmlns:w16du="http://schemas.microsoft.com/office/word/2023/wordml/word16du" xmlns:w16sdtdh="http://schemas.microsoft.com/office/word/2020/wordml/sdtdatahash" xmlns:w16sdtfl="http://schemas.microsoft.com/office/word/2024/wordml/sdtformatlock" xmlns:w16se="http://schemas.microsoft.com/office/word/2015/wordml/symex" xmlns:wpg="http://schemas.microsoft.com/office/word/2010/wordprocessingGroup" xmlns:wpi="http://schemas.microsoft.com/office/word/2010/wordprocessingInk" xmlns:wne="http://schemas.microsoft.com/office/word/2006/wordml" xmlns:wps="http://schemas.microsoft.com/office/word/2010/wordprocessingShape" mc:Ignorable="w14 w15 w16se w16cid w16 w16cex w16sdtdh w16sdtfl w16du wp14">
+<w:numbering xmlns:wpc="http://schemas.microsoft.com/office/word/2010/wordprocessingCanvas" xmlns:cx="http://schemas.microsoft.com/office/drawing/2014/chartex" xmlns:cx1="http://schemas.microsoft.com/office/drawing/2015/9/8/chartex" xmlns:cx2="http://schemas.microsoft.com/office/drawing/2015/10/21/chartex" xmlns:cx3="http://schemas.microsoft.com/office/drawing/2016/5/9/chartex" xmlns:cx4="http://schemas.microsoft.com/office/drawing/2016/5/10/chartex" xmlns:cx5="http://schemas.microsoft.com/office/drawing/2016/5/11/chartex" xmlns:cx6="http://schemas.microsoft.com/office/drawing/2016/5/12/chartex" xmlns:cx7="http://schemas.microsoft.com/office/drawing/2016/5/13/chartex" xmlns:cx8="http://schemas.microsoft.com/office/drawing/2016/5/14/chartex" xmlns:mc="http://schemas.openxmlformats.org/markup-compatibility/2006" xmlns:aink="http://schemas.microsoft.com/office/drawing/2016/ink" xmlns:am3d="http://schemas.microsoft.com/office/drawing/2017/model3d" xmlns:o="urn:schemas-microsoft-com:office:office" xmlns:oel="http://schemas.microsoft.com/office/2019/extlst" xmlns:r="http://schemas.openxmlformats.org/officeDocument/2006/relationships" xmlns:m="http://schemas.openxmlformats.org/officeDocument/2006/math" xmlns:v="urn:schemas-microsoft-com:vml" xmlns:wp14="http://schemas.microsoft.com/office/word/2010/wordprocessingDrawing" xmlns:wp="http://schemas.openxmlformats.org/drawingml/2006/wordprocessingDrawing" xmlns:w10="urn:schemas-microsoft-com:office:word" xmlns:w="http://schemas.openxmlformats.org/wordprocessingml/2006/main" xmlns:w14="http://schemas.microsoft.com/office/word/2010/wordml" xmlns:w15="http://schemas.microsoft.com/office/word/2012/wordml" xmlns:w16cei="http://schemas.microsoft.com/office/word/2026/wordml/cei" xmlns:w16cex="http://schemas.microsoft.com/office/word/2018/wordml/cex" xmlns:w16cid="http://schemas.microsoft.com/office/word/2016/wordml/cid" xmlns:w16="http://schemas.microsoft.com/office/word/2018/wordml" xmlns:w16du="http://schemas.microsoft.com/office/word/2023/wordml/word16du" xmlns:w16sdtdh="http://schemas.microsoft.com/office/word/2020/wordml/sdtdatahash" xmlns:w16sdtfl="http://schemas.microsoft.com/office/word/2024/wordml/sdtformatlock" xmlns:w16se="http://schemas.microsoft.com/office/word/2015/wordml/symex" xmlns:wpg="http://schemas.microsoft.com/office/word/2010/wordprocessingGroup" xmlns:wpi="http://schemas.microsoft.com/office/word/2010/wordprocessingInk" xmlns:wne="http://schemas.microsoft.com/office/word/2006/wordml" xmlns:wps="http://schemas.microsoft.com/office/word/2010/wordprocessingShape" mc:Ignorable="w14 w15 w16se w16cid w16 w16cex w16sdtdh w16sdtfl w16du wp14">
   <w:abstractNum w:abstractNumId="0" w15:restartNumberingAfterBreak="0">
     <w:nsid w:val="4F1236F6"/>
     <w:multiLevelType w:val="multilevel"/>

</xml_diff>